<commit_message>
Added API Functionalities on the API Doc
</commit_message>
<xml_diff>
--- a/ProjectBackend/API DOC.docx
+++ b/ProjectBackend/API DOC.docx
@@ -2,6 +2,327 @@
 <file path=word/document.xml><?xml version="1.0" encoding="utf-8"?>
 <w:document xmlns:wpc="http://schemas.microsoft.com/office/word/2010/wordprocessingCanvas" xmlns:cx="http://schemas.microsoft.com/office/drawing/2014/chartex" xmlns:cx1="http://schemas.microsoft.com/office/drawing/2015/9/8/chartex" xmlns:cx2="http://schemas.microsoft.com/office/drawing/2015/10/21/chartex" xmlns:cx3="http://schemas.microsoft.com/office/drawing/2016/5/9/chartex" xmlns:cx4="http://schemas.microsoft.com/office/drawing/2016/5/10/chartex" xmlns:cx5="http://schemas.microsoft.com/office/drawing/2016/5/11/chartex" xmlns:cx6="http://schemas.microsoft.com/office/drawing/2016/5/12/chartex" xmlns:cx7="http://schemas.microsoft.com/office/drawing/2016/5/13/chartex" xmlns:cx8="http://schemas.microsoft.com/office/drawing/2016/5/14/chartex" xmlns:mc="http://schemas.openxmlformats.org/markup-compatibility/2006" xmlns:aink="http://schemas.microsoft.com/office/drawing/2016/ink" xmlns:am3d="http://schemas.microsoft.com/office/drawing/2017/model3d" xmlns:o="urn:schemas-microsoft-com:office:office" xmlns:oel="http://schemas.microsoft.com/office/2019/extlst" xmlns:r="http://schemas.openxmlformats.org/officeDocument/2006/relationships" xmlns:m="http://schemas.openxmlformats.org/officeDocument/2006/math" xmlns:v="urn:schemas-microsoft-com:vml" xmlns:wp14="http://schemas.microsoft.com/office/word/2010/wordprocessingDrawing" xmlns:wp="http://schemas.openxmlformats.org/drawingml/2006/wordprocessingDrawing" xmlns:w10="urn:schemas-microsoft-com:office:word" xmlns:w="http://schemas.openxmlformats.org/wordprocessingml/2006/main" xmlns:w14="http://schemas.microsoft.com/office/word/2010/wordml" xmlns:w15="http://schemas.microsoft.com/office/word/2012/wordml" xmlns:w16cex="http://schemas.microsoft.com/office/word/2018/wordml/cex" xmlns:w16cid="http://schemas.microsoft.com/office/word/2016/wordml/cid" xmlns:w16="http://schemas.microsoft.com/office/word/2018/wordml" xmlns:w16du="http://schemas.microsoft.com/office/word/2023/wordml/word16du" xmlns:w16sdtdh="http://schemas.microsoft.com/office/word/2020/wordml/sdtdatahash" xmlns:w16se="http://schemas.microsoft.com/office/word/2015/wordml/symex" xmlns:wpg="http://schemas.microsoft.com/office/word/2010/wordprocessingGroup" xmlns:wpi="http://schemas.microsoft.com/office/word/2010/wordprocessingInk" xmlns:wne="http://schemas.microsoft.com/office/word/2006/wordml" xmlns:wps="http://schemas.microsoft.com/office/word/2010/wordprocessingShape" mc:Ignorable="w14 w15 w16se w16cid w16 w16cex w16sdtdh w16du wp14">
   <w:body>
+    <w:p>
+      <w:r>
+        <w:t>API Functionalities:</w:t>
+      </w:r>
+    </w:p>
+    <w:p>
+      <w:r>
+        <w:t>The following things should happen when testing the REST API:</w:t>
+      </w:r>
+    </w:p>
+    <w:p>
+      <w:r>
+        <w:t>FAQ:</w:t>
+      </w:r>
+    </w:p>
+    <w:p>
+      <w:pPr>
+        <w:pStyle w:val="ListParagraph"/>
+        <w:numPr>
+          <w:ilvl w:val="0"/>
+          <w:numId w:val="1"/>
+        </w:numPr>
+      </w:pPr>
+      <w:r>
+        <w:t>Read: Ensures that the user can retrieve and view a specific FAQ and be able to answer the Question.</w:t>
+      </w:r>
+    </w:p>
+    <w:p>
+      <w:pPr>
+        <w:pStyle w:val="ListParagraph"/>
+        <w:numPr>
+          <w:ilvl w:val="0"/>
+          <w:numId w:val="1"/>
+        </w:numPr>
+      </w:pPr>
+      <w:r>
+        <w:t>Update: Helps verify the users to be able to update an FAQ and to show that the updated information is correctly reflected</w:t>
+      </w:r>
+    </w:p>
+    <w:p>
+      <w:pPr>
+        <w:pStyle w:val="ListParagraph"/>
+        <w:numPr>
+          <w:ilvl w:val="0"/>
+          <w:numId w:val="1"/>
+        </w:numPr>
+      </w:pPr>
+      <w:r>
+        <w:t>Delete: To ensure that a user can delete an FAQ, which must also be reflected on the database that it has been deleted.</w:t>
+      </w:r>
+    </w:p>
+    <w:p>
+      <w:pPr>
+        <w:pStyle w:val="ListParagraph"/>
+        <w:numPr>
+          <w:ilvl w:val="0"/>
+          <w:numId w:val="1"/>
+        </w:numPr>
+      </w:pPr>
+      <w:r>
+        <w:t>Create: Should verify that new FAQs have been added and is correctly added into the database.</w:t>
+      </w:r>
+    </w:p>
+    <w:p>
+      <w:r>
+        <w:t>Document Search:</w:t>
+      </w:r>
+    </w:p>
+    <w:p>
+      <w:pPr>
+        <w:pStyle w:val="ListParagraph"/>
+        <w:numPr>
+          <w:ilvl w:val="0"/>
+          <w:numId w:val="2"/>
+        </w:numPr>
+      </w:pPr>
+      <w:r>
+        <w:t>Read:</w:t>
+      </w:r>
+      <w:r>
+        <w:t xml:space="preserve"> To ensure that </w:t>
+      </w:r>
+      <w:r>
+        <w:t>any documents that is searched is retrieved correctly based on the user’s search input</w:t>
+      </w:r>
+      <w:r>
+        <w:t xml:space="preserve"> </w:t>
+      </w:r>
+    </w:p>
+    <w:p>
+      <w:r>
+        <w:t>Resource Contribution:</w:t>
+      </w:r>
+    </w:p>
+    <w:p>
+      <w:pPr>
+        <w:pStyle w:val="ListParagraph"/>
+        <w:numPr>
+          <w:ilvl w:val="0"/>
+          <w:numId w:val="3"/>
+        </w:numPr>
+      </w:pPr>
+      <w:r>
+        <w:t xml:space="preserve">Read: </w:t>
+      </w:r>
+      <w:r>
+        <w:t>User should be able to read and retrieve the correct documents.</w:t>
+      </w:r>
+    </w:p>
+    <w:p>
+      <w:pPr>
+        <w:pStyle w:val="ListParagraph"/>
+        <w:numPr>
+          <w:ilvl w:val="0"/>
+          <w:numId w:val="3"/>
+        </w:numPr>
+      </w:pPr>
+      <w:r>
+        <w:t xml:space="preserve">Update: </w:t>
+      </w:r>
+      <w:r>
+        <w:t>Should ensure that the user can update an existing document.</w:t>
+      </w:r>
+    </w:p>
+    <w:p>
+      <w:pPr>
+        <w:pStyle w:val="ListParagraph"/>
+        <w:numPr>
+          <w:ilvl w:val="0"/>
+          <w:numId w:val="3"/>
+        </w:numPr>
+      </w:pPr>
+      <w:r>
+        <w:t xml:space="preserve">Delete: </w:t>
+      </w:r>
+      <w:r>
+        <w:t>Users should be able to verify deleted documents.</w:t>
+      </w:r>
+    </w:p>
+    <w:p>
+      <w:pPr>
+        <w:pStyle w:val="ListParagraph"/>
+        <w:numPr>
+          <w:ilvl w:val="0"/>
+          <w:numId w:val="3"/>
+        </w:numPr>
+      </w:pPr>
+      <w:r>
+        <w:t xml:space="preserve">Create: </w:t>
+      </w:r>
+      <w:r>
+        <w:t>Helps verify that users have added new documents, and they are inserted correctly.</w:t>
+      </w:r>
+    </w:p>
+    <w:p>
+      <w:r>
+        <w:t>User Management:</w:t>
+      </w:r>
+    </w:p>
+    <w:p>
+      <w:pPr>
+        <w:pStyle w:val="ListParagraph"/>
+        <w:numPr>
+          <w:ilvl w:val="0"/>
+          <w:numId w:val="4"/>
+        </w:numPr>
+      </w:pPr>
+      <w:r>
+        <w:t xml:space="preserve">Read: </w:t>
+      </w:r>
+      <w:r>
+        <w:t>User details should be correctly retrieved.</w:t>
+      </w:r>
+    </w:p>
+    <w:p>
+      <w:pPr>
+        <w:pStyle w:val="ListParagraph"/>
+        <w:numPr>
+          <w:ilvl w:val="0"/>
+          <w:numId w:val="4"/>
+        </w:numPr>
+      </w:pPr>
+      <w:r>
+        <w:t>Update:</w:t>
+      </w:r>
+      <w:r>
+        <w:t xml:space="preserve"> It will help users to ensure that their details have been updated.</w:t>
+      </w:r>
+    </w:p>
+    <w:p>
+      <w:pPr>
+        <w:pStyle w:val="ListParagraph"/>
+        <w:numPr>
+          <w:ilvl w:val="0"/>
+          <w:numId w:val="4"/>
+        </w:numPr>
+      </w:pPr>
+      <w:r>
+        <w:t>Delete:</w:t>
+      </w:r>
+      <w:r>
+        <w:t xml:space="preserve"> Returns verification to a user, that all related data has been removed. </w:t>
+      </w:r>
+    </w:p>
+    <w:p>
+      <w:pPr>
+        <w:pStyle w:val="ListParagraph"/>
+        <w:numPr>
+          <w:ilvl w:val="0"/>
+          <w:numId w:val="4"/>
+        </w:numPr>
+      </w:pPr>
+      <w:r>
+        <w:t xml:space="preserve">Create: </w:t>
+      </w:r>
+      <w:r>
+        <w:t>Should verify that new users can sign up and that all their details are correctly stored</w:t>
+      </w:r>
+    </w:p>
+    <w:p>
+      <w:r>
+        <w:t>Resource Report:</w:t>
+      </w:r>
+    </w:p>
+    <w:p>
+      <w:pPr>
+        <w:pStyle w:val="ListParagraph"/>
+        <w:numPr>
+          <w:ilvl w:val="0"/>
+          <w:numId w:val="5"/>
+        </w:numPr>
+      </w:pPr>
+      <w:r>
+        <w:t>Read:</w:t>
+      </w:r>
+      <w:r>
+        <w:t xml:space="preserve"> Show a user all existing reports</w:t>
+      </w:r>
+    </w:p>
+    <w:p>
+      <w:pPr>
+        <w:pStyle w:val="ListParagraph"/>
+        <w:numPr>
+          <w:ilvl w:val="0"/>
+          <w:numId w:val="5"/>
+        </w:numPr>
+      </w:pPr>
+      <w:r>
+        <w:t xml:space="preserve">Delete: </w:t>
+      </w:r>
+      <w:r>
+        <w:t>Reflect all reports that could be deleted by users</w:t>
+      </w:r>
+    </w:p>
+    <w:p>
+      <w:pPr>
+        <w:pStyle w:val="ListParagraph"/>
+        <w:numPr>
+          <w:ilvl w:val="0"/>
+          <w:numId w:val="5"/>
+        </w:numPr>
+      </w:pPr>
+      <w:r>
+        <w:t>Create:</w:t>
+      </w:r>
+      <w:r>
+        <w:t xml:space="preserve"> Produce required reports, given by the user.</w:t>
+      </w:r>
+    </w:p>
+    <w:p/>
+    <w:p/>
+    <w:p>
+      <w:r>
+        <w:lastRenderedPageBreak/>
+        <w:t>Resource Review:</w:t>
+      </w:r>
+    </w:p>
+    <w:p>
+      <w:pPr>
+        <w:pStyle w:val="ListParagraph"/>
+        <w:numPr>
+          <w:ilvl w:val="0"/>
+          <w:numId w:val="6"/>
+        </w:numPr>
+      </w:pPr>
+      <w:r>
+        <w:t xml:space="preserve">Read: </w:t>
+      </w:r>
+    </w:p>
+    <w:p>
+      <w:pPr>
+        <w:pStyle w:val="ListParagraph"/>
+        <w:numPr>
+          <w:ilvl w:val="0"/>
+          <w:numId w:val="6"/>
+        </w:numPr>
+      </w:pPr>
+      <w:r>
+        <w:t xml:space="preserve">Update: </w:t>
+      </w:r>
+    </w:p>
+    <w:p>
+      <w:pPr>
+        <w:pStyle w:val="ListParagraph"/>
+        <w:numPr>
+          <w:ilvl w:val="0"/>
+          <w:numId w:val="6"/>
+        </w:numPr>
+      </w:pPr>
+      <w:r>
+        <w:t xml:space="preserve">Create: </w:t>
+      </w:r>
+    </w:p>
+    <w:p/>
+    <w:p/>
+    <w:p>
+      <w:pPr>
+        <w:pStyle w:val="ListParagraph"/>
+      </w:pPr>
+    </w:p>
+    <w:p/>
     <w:p/>
     <w:sectPr>
       <w:pgSz w:w="12240" w:h="15840"/>
@@ -11,6 +332,563 @@
     </w:sectPr>
   </w:body>
 </w:document>
+</file>
+
+<file path=word/numbering.xml><?xml version="1.0" encoding="utf-8"?>
+<w:numbering xmlns:wpc="http://schemas.microsoft.com/office/word/2010/wordprocessingCanvas" xmlns:cx="http://schemas.microsoft.com/office/drawing/2014/chartex" xmlns:cx1="http://schemas.microsoft.com/office/drawing/2015/9/8/chartex" xmlns:cx2="http://schemas.microsoft.com/office/drawing/2015/10/21/chartex" xmlns:cx3="http://schemas.microsoft.com/office/drawing/2016/5/9/chartex" xmlns:cx4="http://schemas.microsoft.com/office/drawing/2016/5/10/chartex" xmlns:cx5="http://schemas.microsoft.com/office/drawing/2016/5/11/chartex" xmlns:cx6="http://schemas.microsoft.com/office/drawing/2016/5/12/chartex" xmlns:cx7="http://schemas.microsoft.com/office/drawing/2016/5/13/chartex" xmlns:cx8="http://schemas.microsoft.com/office/drawing/2016/5/14/chartex" xmlns:mc="http://schemas.openxmlformats.org/markup-compatibility/2006" xmlns:aink="http://schemas.microsoft.com/office/drawing/2016/ink" xmlns:am3d="http://schemas.microsoft.com/office/drawing/2017/model3d" xmlns:o="urn:schemas-microsoft-com:office:office" xmlns:oel="http://schemas.microsoft.com/office/2019/extlst" xmlns:r="http://schemas.openxmlformats.org/officeDocument/2006/relationships" xmlns:m="http://schemas.openxmlformats.org/officeDocument/2006/math" xmlns:v="urn:schemas-microsoft-com:vml" xmlns:wp14="http://schemas.microsoft.com/office/word/2010/wordprocessingDrawing" xmlns:wp="http://schemas.openxmlformats.org/drawingml/2006/wordprocessingDrawing" xmlns:w10="urn:schemas-microsoft-com:office:word" xmlns:w="http://schemas.openxmlformats.org/wordprocessingml/2006/main" xmlns:w14="http://schemas.microsoft.com/office/word/2010/wordml" xmlns:w15="http://schemas.microsoft.com/office/word/2012/wordml" xmlns:w16cex="http://schemas.microsoft.com/office/word/2018/wordml/cex" xmlns:w16cid="http://schemas.microsoft.com/office/word/2016/wordml/cid" xmlns:w16="http://schemas.microsoft.com/office/word/2018/wordml" xmlns:w16du="http://schemas.microsoft.com/office/word/2023/wordml/word16du" xmlns:w16sdtdh="http://schemas.microsoft.com/office/word/2020/wordml/sdtdatahash" xmlns:w16se="http://schemas.microsoft.com/office/word/2015/wordml/symex" xmlns:wpg="http://schemas.microsoft.com/office/word/2010/wordprocessingGroup" xmlns:wpi="http://schemas.microsoft.com/office/word/2010/wordprocessingInk" xmlns:wne="http://schemas.microsoft.com/office/word/2006/wordml" xmlns:wps="http://schemas.microsoft.com/office/word/2010/wordprocessingShape" mc:Ignorable="w14 w15 w16se w16cid w16 w16cex w16sdtdh w16du wp14">
+  <w:abstractNum w:abstractNumId="0" w15:restartNumberingAfterBreak="0">
+    <w:nsid w:val="113301B1"/>
+    <w:multiLevelType w:val="hybridMultilevel"/>
+    <w:tmpl w:val="E87EEB38"/>
+    <w:lvl w:ilvl="0" w:tplc="FFFFFFFF">
+      <w:start w:val="1"/>
+      <w:numFmt w:val="decimal"/>
+      <w:lvlText w:val="%1."/>
+      <w:lvlJc w:val="left"/>
+      <w:pPr>
+        <w:ind w:left="720" w:hanging="360"/>
+      </w:pPr>
+      <w:rPr>
+        <w:rFonts w:hint="default"/>
+      </w:rPr>
+    </w:lvl>
+    <w:lvl w:ilvl="1" w:tplc="FFFFFFFF" w:tentative="1">
+      <w:start w:val="1"/>
+      <w:numFmt w:val="lowerLetter"/>
+      <w:lvlText w:val="%2."/>
+      <w:lvlJc w:val="left"/>
+      <w:pPr>
+        <w:ind w:left="1440" w:hanging="360"/>
+      </w:pPr>
+    </w:lvl>
+    <w:lvl w:ilvl="2" w:tplc="FFFFFFFF" w:tentative="1">
+      <w:start w:val="1"/>
+      <w:numFmt w:val="lowerRoman"/>
+      <w:lvlText w:val="%3."/>
+      <w:lvlJc w:val="right"/>
+      <w:pPr>
+        <w:ind w:left="2160" w:hanging="180"/>
+      </w:pPr>
+    </w:lvl>
+    <w:lvl w:ilvl="3" w:tplc="FFFFFFFF" w:tentative="1">
+      <w:start w:val="1"/>
+      <w:numFmt w:val="decimal"/>
+      <w:lvlText w:val="%4."/>
+      <w:lvlJc w:val="left"/>
+      <w:pPr>
+        <w:ind w:left="2880" w:hanging="360"/>
+      </w:pPr>
+    </w:lvl>
+    <w:lvl w:ilvl="4" w:tplc="FFFFFFFF" w:tentative="1">
+      <w:start w:val="1"/>
+      <w:numFmt w:val="lowerLetter"/>
+      <w:lvlText w:val="%5."/>
+      <w:lvlJc w:val="left"/>
+      <w:pPr>
+        <w:ind w:left="3600" w:hanging="360"/>
+      </w:pPr>
+    </w:lvl>
+    <w:lvl w:ilvl="5" w:tplc="FFFFFFFF" w:tentative="1">
+      <w:start w:val="1"/>
+      <w:numFmt w:val="lowerRoman"/>
+      <w:lvlText w:val="%6."/>
+      <w:lvlJc w:val="right"/>
+      <w:pPr>
+        <w:ind w:left="4320" w:hanging="180"/>
+      </w:pPr>
+    </w:lvl>
+    <w:lvl w:ilvl="6" w:tplc="FFFFFFFF" w:tentative="1">
+      <w:start w:val="1"/>
+      <w:numFmt w:val="decimal"/>
+      <w:lvlText w:val="%7."/>
+      <w:lvlJc w:val="left"/>
+      <w:pPr>
+        <w:ind w:left="5040" w:hanging="360"/>
+      </w:pPr>
+    </w:lvl>
+    <w:lvl w:ilvl="7" w:tplc="FFFFFFFF" w:tentative="1">
+      <w:start w:val="1"/>
+      <w:numFmt w:val="lowerLetter"/>
+      <w:lvlText w:val="%8."/>
+      <w:lvlJc w:val="left"/>
+      <w:pPr>
+        <w:ind w:left="5760" w:hanging="360"/>
+      </w:pPr>
+    </w:lvl>
+    <w:lvl w:ilvl="8" w:tplc="FFFFFFFF" w:tentative="1">
+      <w:start w:val="1"/>
+      <w:numFmt w:val="lowerRoman"/>
+      <w:lvlText w:val="%9."/>
+      <w:lvlJc w:val="right"/>
+      <w:pPr>
+        <w:ind w:left="6480" w:hanging="180"/>
+      </w:pPr>
+    </w:lvl>
+  </w:abstractNum>
+  <w:abstractNum w:abstractNumId="1" w15:restartNumberingAfterBreak="0">
+    <w:nsid w:val="1FC50643"/>
+    <w:multiLevelType w:val="hybridMultilevel"/>
+    <w:tmpl w:val="E87EEB38"/>
+    <w:lvl w:ilvl="0" w:tplc="0409000F">
+      <w:start w:val="1"/>
+      <w:numFmt w:val="decimal"/>
+      <w:lvlText w:val="%1."/>
+      <w:lvlJc w:val="left"/>
+      <w:pPr>
+        <w:ind w:left="720" w:hanging="360"/>
+      </w:pPr>
+      <w:rPr>
+        <w:rFonts w:hint="default"/>
+      </w:rPr>
+    </w:lvl>
+    <w:lvl w:ilvl="1" w:tplc="04090019" w:tentative="1">
+      <w:start w:val="1"/>
+      <w:numFmt w:val="lowerLetter"/>
+      <w:lvlText w:val="%2."/>
+      <w:lvlJc w:val="left"/>
+      <w:pPr>
+        <w:ind w:left="1440" w:hanging="360"/>
+      </w:pPr>
+    </w:lvl>
+    <w:lvl w:ilvl="2" w:tplc="0409001B" w:tentative="1">
+      <w:start w:val="1"/>
+      <w:numFmt w:val="lowerRoman"/>
+      <w:lvlText w:val="%3."/>
+      <w:lvlJc w:val="right"/>
+      <w:pPr>
+        <w:ind w:left="2160" w:hanging="180"/>
+      </w:pPr>
+    </w:lvl>
+    <w:lvl w:ilvl="3" w:tplc="0409000F" w:tentative="1">
+      <w:start w:val="1"/>
+      <w:numFmt w:val="decimal"/>
+      <w:lvlText w:val="%4."/>
+      <w:lvlJc w:val="left"/>
+      <w:pPr>
+        <w:ind w:left="2880" w:hanging="360"/>
+      </w:pPr>
+    </w:lvl>
+    <w:lvl w:ilvl="4" w:tplc="04090019" w:tentative="1">
+      <w:start w:val="1"/>
+      <w:numFmt w:val="lowerLetter"/>
+      <w:lvlText w:val="%5."/>
+      <w:lvlJc w:val="left"/>
+      <w:pPr>
+        <w:ind w:left="3600" w:hanging="360"/>
+      </w:pPr>
+    </w:lvl>
+    <w:lvl w:ilvl="5" w:tplc="0409001B" w:tentative="1">
+      <w:start w:val="1"/>
+      <w:numFmt w:val="lowerRoman"/>
+      <w:lvlText w:val="%6."/>
+      <w:lvlJc w:val="right"/>
+      <w:pPr>
+        <w:ind w:left="4320" w:hanging="180"/>
+      </w:pPr>
+    </w:lvl>
+    <w:lvl w:ilvl="6" w:tplc="0409000F" w:tentative="1">
+      <w:start w:val="1"/>
+      <w:numFmt w:val="decimal"/>
+      <w:lvlText w:val="%7."/>
+      <w:lvlJc w:val="left"/>
+      <w:pPr>
+        <w:ind w:left="5040" w:hanging="360"/>
+      </w:pPr>
+    </w:lvl>
+    <w:lvl w:ilvl="7" w:tplc="04090019" w:tentative="1">
+      <w:start w:val="1"/>
+      <w:numFmt w:val="lowerLetter"/>
+      <w:lvlText w:val="%8."/>
+      <w:lvlJc w:val="left"/>
+      <w:pPr>
+        <w:ind w:left="5760" w:hanging="360"/>
+      </w:pPr>
+    </w:lvl>
+    <w:lvl w:ilvl="8" w:tplc="0409001B" w:tentative="1">
+      <w:start w:val="1"/>
+      <w:numFmt w:val="lowerRoman"/>
+      <w:lvlText w:val="%9."/>
+      <w:lvlJc w:val="right"/>
+      <w:pPr>
+        <w:ind w:left="6480" w:hanging="180"/>
+      </w:pPr>
+    </w:lvl>
+  </w:abstractNum>
+  <w:abstractNum w:abstractNumId="2" w15:restartNumberingAfterBreak="0">
+    <w:nsid w:val="203A0834"/>
+    <w:multiLevelType w:val="hybridMultilevel"/>
+    <w:tmpl w:val="E87EEB38"/>
+    <w:lvl w:ilvl="0" w:tplc="FFFFFFFF">
+      <w:start w:val="1"/>
+      <w:numFmt w:val="decimal"/>
+      <w:lvlText w:val="%1."/>
+      <w:lvlJc w:val="left"/>
+      <w:pPr>
+        <w:ind w:left="720" w:hanging="360"/>
+      </w:pPr>
+      <w:rPr>
+        <w:rFonts w:hint="default"/>
+      </w:rPr>
+    </w:lvl>
+    <w:lvl w:ilvl="1" w:tplc="FFFFFFFF" w:tentative="1">
+      <w:start w:val="1"/>
+      <w:numFmt w:val="lowerLetter"/>
+      <w:lvlText w:val="%2."/>
+      <w:lvlJc w:val="left"/>
+      <w:pPr>
+        <w:ind w:left="1440" w:hanging="360"/>
+      </w:pPr>
+    </w:lvl>
+    <w:lvl w:ilvl="2" w:tplc="FFFFFFFF" w:tentative="1">
+      <w:start w:val="1"/>
+      <w:numFmt w:val="lowerRoman"/>
+      <w:lvlText w:val="%3."/>
+      <w:lvlJc w:val="right"/>
+      <w:pPr>
+        <w:ind w:left="2160" w:hanging="180"/>
+      </w:pPr>
+    </w:lvl>
+    <w:lvl w:ilvl="3" w:tplc="FFFFFFFF" w:tentative="1">
+      <w:start w:val="1"/>
+      <w:numFmt w:val="decimal"/>
+      <w:lvlText w:val="%4."/>
+      <w:lvlJc w:val="left"/>
+      <w:pPr>
+        <w:ind w:left="2880" w:hanging="360"/>
+      </w:pPr>
+    </w:lvl>
+    <w:lvl w:ilvl="4" w:tplc="FFFFFFFF" w:tentative="1">
+      <w:start w:val="1"/>
+      <w:numFmt w:val="lowerLetter"/>
+      <w:lvlText w:val="%5."/>
+      <w:lvlJc w:val="left"/>
+      <w:pPr>
+        <w:ind w:left="3600" w:hanging="360"/>
+      </w:pPr>
+    </w:lvl>
+    <w:lvl w:ilvl="5" w:tplc="FFFFFFFF" w:tentative="1">
+      <w:start w:val="1"/>
+      <w:numFmt w:val="lowerRoman"/>
+      <w:lvlText w:val="%6."/>
+      <w:lvlJc w:val="right"/>
+      <w:pPr>
+        <w:ind w:left="4320" w:hanging="180"/>
+      </w:pPr>
+    </w:lvl>
+    <w:lvl w:ilvl="6" w:tplc="FFFFFFFF" w:tentative="1">
+      <w:start w:val="1"/>
+      <w:numFmt w:val="decimal"/>
+      <w:lvlText w:val="%7."/>
+      <w:lvlJc w:val="left"/>
+      <w:pPr>
+        <w:ind w:left="5040" w:hanging="360"/>
+      </w:pPr>
+    </w:lvl>
+    <w:lvl w:ilvl="7" w:tplc="FFFFFFFF" w:tentative="1">
+      <w:start w:val="1"/>
+      <w:numFmt w:val="lowerLetter"/>
+      <w:lvlText w:val="%8."/>
+      <w:lvlJc w:val="left"/>
+      <w:pPr>
+        <w:ind w:left="5760" w:hanging="360"/>
+      </w:pPr>
+    </w:lvl>
+    <w:lvl w:ilvl="8" w:tplc="FFFFFFFF" w:tentative="1">
+      <w:start w:val="1"/>
+      <w:numFmt w:val="lowerRoman"/>
+      <w:lvlText w:val="%9."/>
+      <w:lvlJc w:val="right"/>
+      <w:pPr>
+        <w:ind w:left="6480" w:hanging="180"/>
+      </w:pPr>
+    </w:lvl>
+  </w:abstractNum>
+  <w:abstractNum w:abstractNumId="3" w15:restartNumberingAfterBreak="0">
+    <w:nsid w:val="29E73374"/>
+    <w:multiLevelType w:val="hybridMultilevel"/>
+    <w:tmpl w:val="E87EEB38"/>
+    <w:lvl w:ilvl="0" w:tplc="FFFFFFFF">
+      <w:start w:val="1"/>
+      <w:numFmt w:val="decimal"/>
+      <w:lvlText w:val="%1."/>
+      <w:lvlJc w:val="left"/>
+      <w:pPr>
+        <w:ind w:left="720" w:hanging="360"/>
+      </w:pPr>
+      <w:rPr>
+        <w:rFonts w:hint="default"/>
+      </w:rPr>
+    </w:lvl>
+    <w:lvl w:ilvl="1" w:tplc="FFFFFFFF" w:tentative="1">
+      <w:start w:val="1"/>
+      <w:numFmt w:val="lowerLetter"/>
+      <w:lvlText w:val="%2."/>
+      <w:lvlJc w:val="left"/>
+      <w:pPr>
+        <w:ind w:left="1440" w:hanging="360"/>
+      </w:pPr>
+    </w:lvl>
+    <w:lvl w:ilvl="2" w:tplc="FFFFFFFF" w:tentative="1">
+      <w:start w:val="1"/>
+      <w:numFmt w:val="lowerRoman"/>
+      <w:lvlText w:val="%3."/>
+      <w:lvlJc w:val="right"/>
+      <w:pPr>
+        <w:ind w:left="2160" w:hanging="180"/>
+      </w:pPr>
+    </w:lvl>
+    <w:lvl w:ilvl="3" w:tplc="FFFFFFFF" w:tentative="1">
+      <w:start w:val="1"/>
+      <w:numFmt w:val="decimal"/>
+      <w:lvlText w:val="%4."/>
+      <w:lvlJc w:val="left"/>
+      <w:pPr>
+        <w:ind w:left="2880" w:hanging="360"/>
+      </w:pPr>
+    </w:lvl>
+    <w:lvl w:ilvl="4" w:tplc="FFFFFFFF" w:tentative="1">
+      <w:start w:val="1"/>
+      <w:numFmt w:val="lowerLetter"/>
+      <w:lvlText w:val="%5."/>
+      <w:lvlJc w:val="left"/>
+      <w:pPr>
+        <w:ind w:left="3600" w:hanging="360"/>
+      </w:pPr>
+    </w:lvl>
+    <w:lvl w:ilvl="5" w:tplc="FFFFFFFF" w:tentative="1">
+      <w:start w:val="1"/>
+      <w:numFmt w:val="lowerRoman"/>
+      <w:lvlText w:val="%6."/>
+      <w:lvlJc w:val="right"/>
+      <w:pPr>
+        <w:ind w:left="4320" w:hanging="180"/>
+      </w:pPr>
+    </w:lvl>
+    <w:lvl w:ilvl="6" w:tplc="FFFFFFFF" w:tentative="1">
+      <w:start w:val="1"/>
+      <w:numFmt w:val="decimal"/>
+      <w:lvlText w:val="%7."/>
+      <w:lvlJc w:val="left"/>
+      <w:pPr>
+        <w:ind w:left="5040" w:hanging="360"/>
+      </w:pPr>
+    </w:lvl>
+    <w:lvl w:ilvl="7" w:tplc="FFFFFFFF" w:tentative="1">
+      <w:start w:val="1"/>
+      <w:numFmt w:val="lowerLetter"/>
+      <w:lvlText w:val="%8."/>
+      <w:lvlJc w:val="left"/>
+      <w:pPr>
+        <w:ind w:left="5760" w:hanging="360"/>
+      </w:pPr>
+    </w:lvl>
+    <w:lvl w:ilvl="8" w:tplc="FFFFFFFF" w:tentative="1">
+      <w:start w:val="1"/>
+      <w:numFmt w:val="lowerRoman"/>
+      <w:lvlText w:val="%9."/>
+      <w:lvlJc w:val="right"/>
+      <w:pPr>
+        <w:ind w:left="6480" w:hanging="180"/>
+      </w:pPr>
+    </w:lvl>
+  </w:abstractNum>
+  <w:abstractNum w:abstractNumId="4" w15:restartNumberingAfterBreak="0">
+    <w:nsid w:val="515151E8"/>
+    <w:multiLevelType w:val="hybridMultilevel"/>
+    <w:tmpl w:val="E87EEB38"/>
+    <w:lvl w:ilvl="0" w:tplc="FFFFFFFF">
+      <w:start w:val="1"/>
+      <w:numFmt w:val="decimal"/>
+      <w:lvlText w:val="%1."/>
+      <w:lvlJc w:val="left"/>
+      <w:pPr>
+        <w:ind w:left="720" w:hanging="360"/>
+      </w:pPr>
+      <w:rPr>
+        <w:rFonts w:hint="default"/>
+      </w:rPr>
+    </w:lvl>
+    <w:lvl w:ilvl="1" w:tplc="FFFFFFFF" w:tentative="1">
+      <w:start w:val="1"/>
+      <w:numFmt w:val="lowerLetter"/>
+      <w:lvlText w:val="%2."/>
+      <w:lvlJc w:val="left"/>
+      <w:pPr>
+        <w:ind w:left="1440" w:hanging="360"/>
+      </w:pPr>
+    </w:lvl>
+    <w:lvl w:ilvl="2" w:tplc="FFFFFFFF" w:tentative="1">
+      <w:start w:val="1"/>
+      <w:numFmt w:val="lowerRoman"/>
+      <w:lvlText w:val="%3."/>
+      <w:lvlJc w:val="right"/>
+      <w:pPr>
+        <w:ind w:left="2160" w:hanging="180"/>
+      </w:pPr>
+    </w:lvl>
+    <w:lvl w:ilvl="3" w:tplc="FFFFFFFF" w:tentative="1">
+      <w:start w:val="1"/>
+      <w:numFmt w:val="decimal"/>
+      <w:lvlText w:val="%4."/>
+      <w:lvlJc w:val="left"/>
+      <w:pPr>
+        <w:ind w:left="2880" w:hanging="360"/>
+      </w:pPr>
+    </w:lvl>
+    <w:lvl w:ilvl="4" w:tplc="FFFFFFFF" w:tentative="1">
+      <w:start w:val="1"/>
+      <w:numFmt w:val="lowerLetter"/>
+      <w:lvlText w:val="%5."/>
+      <w:lvlJc w:val="left"/>
+      <w:pPr>
+        <w:ind w:left="3600" w:hanging="360"/>
+      </w:pPr>
+    </w:lvl>
+    <w:lvl w:ilvl="5" w:tplc="FFFFFFFF" w:tentative="1">
+      <w:start w:val="1"/>
+      <w:numFmt w:val="lowerRoman"/>
+      <w:lvlText w:val="%6."/>
+      <w:lvlJc w:val="right"/>
+      <w:pPr>
+        <w:ind w:left="4320" w:hanging="180"/>
+      </w:pPr>
+    </w:lvl>
+    <w:lvl w:ilvl="6" w:tplc="FFFFFFFF" w:tentative="1">
+      <w:start w:val="1"/>
+      <w:numFmt w:val="decimal"/>
+      <w:lvlText w:val="%7."/>
+      <w:lvlJc w:val="left"/>
+      <w:pPr>
+        <w:ind w:left="5040" w:hanging="360"/>
+      </w:pPr>
+    </w:lvl>
+    <w:lvl w:ilvl="7" w:tplc="FFFFFFFF" w:tentative="1">
+      <w:start w:val="1"/>
+      <w:numFmt w:val="lowerLetter"/>
+      <w:lvlText w:val="%8."/>
+      <w:lvlJc w:val="left"/>
+      <w:pPr>
+        <w:ind w:left="5760" w:hanging="360"/>
+      </w:pPr>
+    </w:lvl>
+    <w:lvl w:ilvl="8" w:tplc="FFFFFFFF" w:tentative="1">
+      <w:start w:val="1"/>
+      <w:numFmt w:val="lowerRoman"/>
+      <w:lvlText w:val="%9."/>
+      <w:lvlJc w:val="right"/>
+      <w:pPr>
+        <w:ind w:left="6480" w:hanging="180"/>
+      </w:pPr>
+    </w:lvl>
+  </w:abstractNum>
+  <w:abstractNum w:abstractNumId="5" w15:restartNumberingAfterBreak="0">
+    <w:nsid w:val="793A68C7"/>
+    <w:multiLevelType w:val="hybridMultilevel"/>
+    <w:tmpl w:val="E87EEB38"/>
+    <w:lvl w:ilvl="0" w:tplc="FFFFFFFF">
+      <w:start w:val="1"/>
+      <w:numFmt w:val="decimal"/>
+      <w:lvlText w:val="%1."/>
+      <w:lvlJc w:val="left"/>
+      <w:pPr>
+        <w:ind w:left="720" w:hanging="360"/>
+      </w:pPr>
+      <w:rPr>
+        <w:rFonts w:hint="default"/>
+      </w:rPr>
+    </w:lvl>
+    <w:lvl w:ilvl="1" w:tplc="FFFFFFFF" w:tentative="1">
+      <w:start w:val="1"/>
+      <w:numFmt w:val="lowerLetter"/>
+      <w:lvlText w:val="%2."/>
+      <w:lvlJc w:val="left"/>
+      <w:pPr>
+        <w:ind w:left="1440" w:hanging="360"/>
+      </w:pPr>
+    </w:lvl>
+    <w:lvl w:ilvl="2" w:tplc="FFFFFFFF" w:tentative="1">
+      <w:start w:val="1"/>
+      <w:numFmt w:val="lowerRoman"/>
+      <w:lvlText w:val="%3."/>
+      <w:lvlJc w:val="right"/>
+      <w:pPr>
+        <w:ind w:left="2160" w:hanging="180"/>
+      </w:pPr>
+    </w:lvl>
+    <w:lvl w:ilvl="3" w:tplc="FFFFFFFF" w:tentative="1">
+      <w:start w:val="1"/>
+      <w:numFmt w:val="decimal"/>
+      <w:lvlText w:val="%4."/>
+      <w:lvlJc w:val="left"/>
+      <w:pPr>
+        <w:ind w:left="2880" w:hanging="360"/>
+      </w:pPr>
+    </w:lvl>
+    <w:lvl w:ilvl="4" w:tplc="FFFFFFFF" w:tentative="1">
+      <w:start w:val="1"/>
+      <w:numFmt w:val="lowerLetter"/>
+      <w:lvlText w:val="%5."/>
+      <w:lvlJc w:val="left"/>
+      <w:pPr>
+        <w:ind w:left="3600" w:hanging="360"/>
+      </w:pPr>
+    </w:lvl>
+    <w:lvl w:ilvl="5" w:tplc="FFFFFFFF" w:tentative="1">
+      <w:start w:val="1"/>
+      <w:numFmt w:val="lowerRoman"/>
+      <w:lvlText w:val="%6."/>
+      <w:lvlJc w:val="right"/>
+      <w:pPr>
+        <w:ind w:left="4320" w:hanging="180"/>
+      </w:pPr>
+    </w:lvl>
+    <w:lvl w:ilvl="6" w:tplc="FFFFFFFF" w:tentative="1">
+      <w:start w:val="1"/>
+      <w:numFmt w:val="decimal"/>
+      <w:lvlText w:val="%7."/>
+      <w:lvlJc w:val="left"/>
+      <w:pPr>
+        <w:ind w:left="5040" w:hanging="360"/>
+      </w:pPr>
+    </w:lvl>
+    <w:lvl w:ilvl="7" w:tplc="FFFFFFFF" w:tentative="1">
+      <w:start w:val="1"/>
+      <w:numFmt w:val="lowerLetter"/>
+      <w:lvlText w:val="%8."/>
+      <w:lvlJc w:val="left"/>
+      <w:pPr>
+        <w:ind w:left="5760" w:hanging="360"/>
+      </w:pPr>
+    </w:lvl>
+    <w:lvl w:ilvl="8" w:tplc="FFFFFFFF" w:tentative="1">
+      <w:start w:val="1"/>
+      <w:numFmt w:val="lowerRoman"/>
+      <w:lvlText w:val="%9."/>
+      <w:lvlJc w:val="right"/>
+      <w:pPr>
+        <w:ind w:left="6480" w:hanging="180"/>
+      </w:pPr>
+    </w:lvl>
+  </w:abstractNum>
+  <w:num w:numId="1" w16cid:durableId="2069374203">
+    <w:abstractNumId w:val="1"/>
+  </w:num>
+  <w:num w:numId="2" w16cid:durableId="1765221229">
+    <w:abstractNumId w:val="5"/>
+  </w:num>
+  <w:num w:numId="3" w16cid:durableId="2056197906">
+    <w:abstractNumId w:val="4"/>
+  </w:num>
+  <w:num w:numId="4" w16cid:durableId="404835494">
+    <w:abstractNumId w:val="0"/>
+  </w:num>
+  <w:num w:numId="5" w16cid:durableId="445121014">
+    <w:abstractNumId w:val="3"/>
+  </w:num>
+  <w:num w:numId="6" w16cid:durableId="1682076120">
+    <w:abstractNumId w:val="2"/>
+  </w:num>
+</w:numbering>
 </file>
 
 <file path=word/styles.xml><?xml version="1.0" encoding="utf-8"?>

</xml_diff>